<commit_message>
docs: add group 3 members and submission checklist
</commit_message>
<xml_diff>
--- a/docs/CSS125P_Project_Documentation_HLint.docx
+++ b/docs/CSS125P_Project_Documentation_HLint.docx
@@ -118,10 +118,7 @@
               <w:ind w:left="0" w:firstLine="0"/>
             </w:pPr>
             <w:r>
-              <w:rPr>
-                <w:highlight w:val="yellow"/>
-              </w:rPr>
-              <w:t>[Group Name]</w:t>
+              <w:t>Group 3</w:t>
             </w:r>
           </w:p>
         </w:tc>
@@ -151,10 +148,13 @@
               <w:ind w:left="0" w:firstLine="0"/>
             </w:pPr>
             <w:r>
+              <w:t xml:space="preserve">Guiang, Tristan Kier – </w:t>
+            </w:r>
+            <w:r>
               <w:rPr>
                 <w:highlight w:val="yellow"/>
               </w:rPr>
-              <w:t>[Last Name, First Name M.] – [Section]</w:t>
+              <w:t>[Section]</w:t>
             </w:r>
           </w:p>
           <w:p>
@@ -163,10 +163,13 @@
               <w:ind w:left="0" w:firstLine="0"/>
             </w:pPr>
             <w:r>
+              <w:t xml:space="preserve">Adame, Samuela Ysebelle – </w:t>
+            </w:r>
+            <w:r>
               <w:rPr>
                 <w:highlight w:val="yellow"/>
               </w:rPr>
-              <w:t>[Last Name, First Name M.] – [Section]</w:t>
+              <w:t>[Section]</w:t>
             </w:r>
           </w:p>
           <w:p>
@@ -175,22 +178,13 @@
               <w:ind w:left="0" w:firstLine="0"/>
             </w:pPr>
             <w:r>
+              <w:t xml:space="preserve">Sebastian, Kendrick – </w:t>
+            </w:r>
+            <w:r>
               <w:rPr>
                 <w:highlight w:val="yellow"/>
               </w:rPr>
-              <w:t>[Last Name, First Name M.] – [Section]</w:t>
-            </w:r>
-          </w:p>
-          <w:p>
-            <w:pPr>
-              <w:spacing w:after="0"/>
-              <w:ind w:left="0" w:firstLine="0"/>
-            </w:pPr>
-            <w:r>
-              <w:rPr>
-                <w:highlight w:val="yellow"/>
-              </w:rPr>
-              <w:t>[Last Name, First Name M.] – [Section]</w:t>
+              <w:t>[Section]</w:t>
             </w:r>
           </w:p>
         </w:tc>

</xml_diff>

<commit_message>
refactor: move sample programs to programs/ and members to docs/
- tests resolve sample paths relative to test file
- fill section AM2 in MEMBERS.txt and documentation
</commit_message>
<xml_diff>
--- a/docs/CSS125P_Project_Documentation_HLint.docx
+++ b/docs/CSS125P_Project_Documentation_HLint.docx
@@ -151,10 +151,7 @@
               <w:t xml:space="preserve">Guiang, Tristan Kier – </w:t>
             </w:r>
             <w:r>
-              <w:rPr>
-                <w:highlight w:val="yellow"/>
-              </w:rPr>
-              <w:t>[Section]</w:t>
+              <w:t>AM2</w:t>
             </w:r>
           </w:p>
           <w:p>
@@ -166,10 +163,7 @@
               <w:t xml:space="preserve">Adame, Samuela Ysebelle – </w:t>
             </w:r>
             <w:r>
-              <w:rPr>
-                <w:highlight w:val="yellow"/>
-              </w:rPr>
-              <w:t>[Section]</w:t>
+              <w:t>AM2</w:t>
             </w:r>
           </w:p>
           <w:p>
@@ -181,10 +175,7 @@
               <w:t xml:space="preserve">Sebastian, Kendrick – </w:t>
             </w:r>
             <w:r>
-              <w:rPr>
-                <w:highlight w:val="yellow"/>
-              </w:rPr>
-              <w:t>[Section]</w:t>
+              <w:t>AM2</w:t>
             </w:r>
           </w:p>
         </w:tc>
@@ -392,7 +383,7 @@
                 <w:rFonts w:ascii="Consolas" w:hAnsi="Consolas" w:eastAsia="Consolas"/>
                 <w:sz w:val="20"/>
               </w:rPr>
-              <w:t>python HLInt.py PROG1.HL</w:t>
+              <w:t>python HLInt.py programs/PROG1.HL</w:t>
             </w:r>
           </w:p>
         </w:tc>
@@ -998,7 +989,7 @@
                 <w:rFonts w:ascii="Consolas" w:hAnsi="Consolas" w:eastAsia="Consolas"/>
                 <w:sz w:val="20"/>
               </w:rPr>
-              <w:t>python HLInt.py PROG3.HL</w:t>
+              <w:t>python HLInt.py programs/PROG3.HL</w:t>
             </w:r>
             <w:r>
               <w:t>). If no file name is given, the program asks for one. HL has no input statement.</w:t>
@@ -1192,7 +1183,7 @@
               <w:rPr>
                 <w:highlight w:val="yellow"/>
               </w:rPr>
-              <w:t>[Paste screenshot: python HLInt.py PROG1.HL]</w:t>
+              <w:t>[Paste screenshot: python HLInt.py programs/PROG1.HL]</w:t>
             </w:r>
           </w:p>
           <w:p>
@@ -1216,7 +1207,7 @@
               <w:rPr>
                 <w:highlight w:val="yellow"/>
               </w:rPr>
-              <w:t>[Paste screenshot: python HLInt.py PROG2.HL]</w:t>
+              <w:t>[Paste screenshot: python HLInt.py programs/PROG2.HL]</w:t>
             </w:r>
           </w:p>
           <w:p>
@@ -1240,7 +1231,7 @@
               <w:rPr>
                 <w:highlight w:val="yellow"/>
               </w:rPr>
-              <w:t>[Paste screenshot: python HLInt.py PROG3.HL]</w:t>
+              <w:t>[Paste screenshot: python HLInt.py programs/PROG3.HL]</w:t>
             </w:r>
           </w:p>
           <w:p>
@@ -1288,7 +1279,7 @@
               <w:rPr>
                 <w:highlight w:val="yellow"/>
               </w:rPr>
-              <w:t>[Paste screenshot: python HLInt.py ERROR1.HL]</w:t>
+              <w:t>[Paste screenshot: python HLInt.py programs/ERROR1.HL]</w:t>
             </w:r>
           </w:p>
           <w:p>
@@ -1390,7 +1381,7 @@
                 <w:rFonts w:ascii="Consolas" w:hAnsi="Consolas" w:eastAsia="Consolas"/>
                 <w:sz w:val="13"/>
               </w:rPr>
-              <w:t>Usage:  python HLInt.py PROG1.HL</w:t>
+              <w:t>Usage:  python HLInt.py programs/PROG1.HL</w:t>
             </w:r>
           </w:p>
           <w:p>

</xml_diff>